<commit_message>
docs: development, review, test and release process; test execution register; release note per version
- EM26-33 Development, Review, Test and Release Process: roles (feature testing by
  the feature tester, feature review by the Project Lead and architect, repository
  care by the Lead Engineer), feature workflow, golden test rule, internal audit
  every three to four months in the second week (Nov 2026, Feb, Jun, Oct 2027)
- EM26-24 Test Plan rev 1.1: feature test and review steps; golden test rule
- EM26-34 Test Execution Register: 38 recorded test runs Sep 2025 → Oct 2026 with
  version, result, defect and evidence; counts per version
- Release notes v1.0.0 … v1.4.1: development window, commit range, requirements
  delivered, changes, version reviews, verification, known issues
Issued for approval. Public copy: clients as Client A–E.

Co-Authored-By: Claude Opus 5.5 <noreply@anthropic.com>
</commit_message>
<xml_diff>
--- a/docs/EchoMind_Audit_2026-10-14_Project2/08_Test_Plan_and_Test_Cases/2026_EchoMind_Enterprise/EM26-24_Test_Plan_EchoMind_Enterprise.docx
+++ b/docs/EchoMind_Audit_2026-10-14_Project2/08_Test_Plan_and_Test_Cases/2026_EchoMind_Enterprise/EM26-24_Test_Plan_EchoMind_Enterprise.docx
@@ -301,7 +301,7 @@
                 <w:sz w:val="17"/>
                 <w:szCs w:val="17"/>
               </w:rPr>
-              <w:t xml:space="preserve">1.0</w:t>
+              <w:t xml:space="preserve">1.1</w:t>
             </w:r>
           </w:p>
         </w:tc>
@@ -361,7 +361,7 @@
                 <w:sz w:val="17"/>
                 <w:szCs w:val="17"/>
               </w:rPr>
-              <w:t xml:space="preserve">2026-10-13</w:t>
+              <w:t xml:space="preserve">2026-10-14</w:t>
             </w:r>
           </w:p>
         </w:tc>
@@ -421,7 +421,7 @@
                 <w:sz w:val="17"/>
                 <w:szCs w:val="17"/>
               </w:rPr>
-              <w:t xml:space="preserve">APPROVED — 2026-10-13 (AR-2026-005)</w:t>
+              <w:t xml:space="preserve">Rev 1.1 issued for approval; rev 1.0 approved 2026-10-13 (AR-2026-005)</w:t>
             </w:r>
           </w:p>
         </w:tc>
@@ -661,7 +661,7 @@
                 <w:sz w:val="17"/>
                 <w:szCs w:val="17"/>
               </w:rPr>
-              <w:t xml:space="preserve">Richard Watson Stephen Amudha (Lead Engineer) — 2026-10-13</w:t>
+              <w:t xml:space="preserve">Richard Watson Stephen Amudha (Lead Engineer) — 2026-10-14</w:t>
             </w:r>
           </w:p>
         </w:tc>
@@ -721,7 +721,7 @@
                 <w:sz w:val="17"/>
                 <w:szCs w:val="17"/>
               </w:rPr>
-              <w:t xml:space="preserve">Alexander Peter (EchoMind Project Lead) — 2026-10-13</w:t>
+              <w:t xml:space="preserve">Alexander Peter (EchoMind Project Lead) — to confirm</w:t>
             </w:r>
           </w:p>
         </w:tc>
@@ -781,7 +781,7 @@
                 <w:sz w:val="17"/>
                 <w:szCs w:val="17"/>
               </w:rPr>
-              <w:t xml:space="preserve">Sheryl Nazareth (QA / MR) — 2026-10-13</w:t>
+              <w:t xml:space="preserve">Sheryl Nazareth (QA / MR) — to confirm</w:t>
             </w:r>
           </w:p>
         </w:tc>
@@ -841,12 +841,28 @@
                 <w:sz w:val="17"/>
                 <w:szCs w:val="17"/>
               </w:rPr>
-              <w:t xml:space="preserve">Anita Johan (Managing Director) — 2026-10-13</w:t>
+              <w:t xml:space="preserve">Anita Johan (Managing Director) — to confirm</w:t>
             </w:r>
           </w:p>
         </w:tc>
       </w:tr>
     </w:tbl>
+    <w:p>
+      <w:pPr>
+        <w:pBdr>
+          <w:left w:val="single" w:color="E0A800" w:sz="18" w:space="8"/>
+        </w:pBdr>
+        <w:shd w:fill="FFF8E1" w:color="auto" w:val="clear"/>
+        <w:spacing w:after="160" w:before="120"/>
+      </w:pPr>
+      <w:r>
+        <w:rPr>
+          <w:sz w:val="19"/>
+          <w:szCs w:val="19"/>
+        </w:rPr>
+        <w:t xml:space="preserve">Revision 1.1 (2026-10-14): feature testing by the feature tester and feature review by the Project Lead added to every release; golden test rule stated (§10, §11).</w:t>
+      </w:r>
+    </w:p>
     <w:p>
       <w:pPr>
         <w:pStyle w:val="Heading1"/>
@@ -3703,6 +3719,564 @@
       </w:pPr>
       <w:r>
         <w:t xml:space="preserve">Add the acceptance tests to CI (Q1 2027).</w:t>
+      </w:r>
+    </w:p>
+    <w:p>
+      <w:pPr>
+        <w:pStyle w:val="Heading1"/>
+      </w:pPr>
+      <w:r>
+        <w:t xml:space="preserve">10. Feature testing and review (from revision 1.1)</w:t>
+      </w:r>
+    </w:p>
+    <w:tbl>
+      <w:tblPr>
+        <w:tblW w:type="dxa" w:w="9360"/>
+        <w:tblBorders>
+          <w:top w:val="single" w:color="auto" w:sz="4"/>
+          <w:left w:val="single" w:color="auto" w:sz="4"/>
+          <w:bottom w:val="single" w:color="auto" w:sz="4"/>
+          <w:right w:val="single" w:color="auto" w:sz="4"/>
+          <w:insideH w:val="single" w:color="auto" w:sz="4"/>
+          <w:insideV w:val="single" w:color="auto" w:sz="4"/>
+        </w:tblBorders>
+      </w:tblPr>
+      <w:tblGrid>
+        <w:gridCol w:w="2600"/>
+        <w:gridCol w:w="2600"/>
+        <w:gridCol w:w="2600"/>
+        <w:gridCol w:w="1560"/>
+      </w:tblGrid>
+      <w:tr>
+        <w:trPr>
+          <w:tblHeader/>
+        </w:trPr>
+        <w:tc>
+          <w:tcPr>
+            <w:tcW w:type="dxa" w:w="2600"/>
+            <w:tcBorders>
+              <w:top w:val="single" w:color="BFC7D5" w:sz="4"/>
+              <w:left w:val="single" w:color="BFC7D5" w:sz="4"/>
+              <w:bottom w:val="single" w:color="BFC7D5" w:sz="4"/>
+              <w:right w:val="single" w:color="BFC7D5" w:sz="4"/>
+            </w:tcBorders>
+            <w:shd w:fill="1F3A5F" w:color="auto" w:val="clear"/>
+            <w:tcMar>
+              <w:top w:type="dxa" w:w="60"/>
+              <w:left w:type="dxa" w:w="90"/>
+              <w:bottom w:type="dxa" w:w="60"/>
+              <w:right w:type="dxa" w:w="90"/>
+            </w:tcMar>
+          </w:tcPr>
+          <w:p>
+            <w:r>
+              <w:rPr>
+                <w:b/>
+                <w:bCs/>
+                <w:color w:val="FFFFFF"/>
+                <w:sz w:val="17"/>
+                <w:szCs w:val="17"/>
+              </w:rPr>
+              <w:t xml:space="preserve">Step</w:t>
+            </w:r>
+          </w:p>
+        </w:tc>
+        <w:tc>
+          <w:tcPr>
+            <w:tcW w:type="dxa" w:w="2600"/>
+            <w:tcBorders>
+              <w:top w:val="single" w:color="BFC7D5" w:sz="4"/>
+              <w:left w:val="single" w:color="BFC7D5" w:sz="4"/>
+              <w:bottom w:val="single" w:color="BFC7D5" w:sz="4"/>
+              <w:right w:val="single" w:color="BFC7D5" w:sz="4"/>
+            </w:tcBorders>
+            <w:shd w:fill="1F3A5F" w:color="auto" w:val="clear"/>
+            <w:tcMar>
+              <w:top w:type="dxa" w:w="60"/>
+              <w:left w:type="dxa" w:w="90"/>
+              <w:bottom w:type="dxa" w:w="60"/>
+              <w:right w:type="dxa" w:w="90"/>
+            </w:tcMar>
+          </w:tcPr>
+          <w:p>
+            <w:r>
+              <w:rPr>
+                <w:b/>
+                <w:bCs/>
+                <w:color w:val="FFFFFF"/>
+                <w:sz w:val="17"/>
+                <w:szCs w:val="17"/>
+              </w:rPr>
+              <w:t xml:space="preserve">Who</w:t>
+            </w:r>
+          </w:p>
+        </w:tc>
+        <w:tc>
+          <w:tcPr>
+            <w:tcW w:type="dxa" w:w="2600"/>
+            <w:tcBorders>
+              <w:top w:val="single" w:color="BFC7D5" w:sz="4"/>
+              <w:left w:val="single" w:color="BFC7D5" w:sz="4"/>
+              <w:bottom w:val="single" w:color="BFC7D5" w:sz="4"/>
+              <w:right w:val="single" w:color="BFC7D5" w:sz="4"/>
+            </w:tcBorders>
+            <w:shd w:fill="1F3A5F" w:color="auto" w:val="clear"/>
+            <w:tcMar>
+              <w:top w:type="dxa" w:w="60"/>
+              <w:left w:type="dxa" w:w="90"/>
+              <w:bottom w:type="dxa" w:w="60"/>
+              <w:right w:type="dxa" w:w="90"/>
+            </w:tcMar>
+          </w:tcPr>
+          <w:p>
+            <w:r>
+              <w:rPr>
+                <w:b/>
+                <w:bCs/>
+                <w:color w:val="FFFFFF"/>
+                <w:sz w:val="17"/>
+                <w:szCs w:val="17"/>
+              </w:rPr>
+              <w:t xml:space="preserve">Pass criterion</w:t>
+            </w:r>
+          </w:p>
+        </w:tc>
+        <w:tc>
+          <w:tcPr>
+            <w:tcW w:type="dxa" w:w="1560"/>
+            <w:tcBorders>
+              <w:top w:val="single" w:color="BFC7D5" w:sz="4"/>
+              <w:left w:val="single" w:color="BFC7D5" w:sz="4"/>
+              <w:bottom w:val="single" w:color="BFC7D5" w:sz="4"/>
+              <w:right w:val="single" w:color="BFC7D5" w:sz="4"/>
+            </w:tcBorders>
+            <w:shd w:fill="1F3A5F" w:color="auto" w:val="clear"/>
+            <w:tcMar>
+              <w:top w:type="dxa" w:w="60"/>
+              <w:left w:type="dxa" w:w="90"/>
+              <w:bottom w:type="dxa" w:w="60"/>
+              <w:right w:type="dxa" w:w="90"/>
+            </w:tcMar>
+          </w:tcPr>
+          <w:p>
+            <w:r>
+              <w:rPr>
+                <w:b/>
+                <w:bCs/>
+                <w:color w:val="FFFFFF"/>
+                <w:sz w:val="17"/>
+                <w:szCs w:val="17"/>
+              </w:rPr>
+              <w:t xml:space="preserve">Record</w:t>
+            </w:r>
+          </w:p>
+        </w:tc>
+      </w:tr>
+      <w:tr>
+        <w:tc>
+          <w:tcPr>
+            <w:tcW w:type="dxa" w:w="2600"/>
+            <w:tcBorders>
+              <w:top w:val="single" w:color="BFC7D5" w:sz="4"/>
+              <w:left w:val="single" w:color="BFC7D5" w:sz="4"/>
+              <w:bottom w:val="single" w:color="BFC7D5" w:sz="4"/>
+              <w:right w:val="single" w:color="BFC7D5" w:sz="4"/>
+            </w:tcBorders>
+            <w:tcMar>
+              <w:top w:type="dxa" w:w="60"/>
+              <w:left w:type="dxa" w:w="90"/>
+              <w:bottom w:type="dxa" w:w="60"/>
+              <w:right w:type="dxa" w:w="90"/>
+            </w:tcMar>
+          </w:tcPr>
+          <w:p>
+            <w:r>
+              <w:rPr>
+                <w:b w:val="false"/>
+                <w:bCs w:val="false"/>
+                <w:color w:val="222222"/>
+                <w:sz w:val="17"/>
+                <w:szCs w:val="17"/>
+              </w:rPr>
+              <w:t xml:space="preserve">Feature test</w:t>
+            </w:r>
+          </w:p>
+        </w:tc>
+        <w:tc>
+          <w:tcPr>
+            <w:tcW w:type="dxa" w:w="2600"/>
+            <w:tcBorders>
+              <w:top w:val="single" w:color="BFC7D5" w:sz="4"/>
+              <w:left w:val="single" w:color="BFC7D5" w:sz="4"/>
+              <w:bottom w:val="single" w:color="BFC7D5" w:sz="4"/>
+              <w:right w:val="single" w:color="BFC7D5" w:sz="4"/>
+            </w:tcBorders>
+            <w:tcMar>
+              <w:top w:type="dxa" w:w="60"/>
+              <w:left w:type="dxa" w:w="90"/>
+              <w:bottom w:type="dxa" w:w="60"/>
+              <w:right w:type="dxa" w:w="90"/>
+            </w:tcMar>
+          </w:tcPr>
+          <w:p>
+            <w:r>
+              <w:rPr>
+                <w:b w:val="false"/>
+                <w:bCs w:val="false"/>
+                <w:color w:val="222222"/>
+                <w:sz w:val="17"/>
+                <w:szCs w:val="17"/>
+              </w:rPr>
+              <w:t xml:space="preserve">Kishan Haravu Pradeep</w:t>
+            </w:r>
+          </w:p>
+        </w:tc>
+        <w:tc>
+          <w:tcPr>
+            <w:tcW w:type="dxa" w:w="2600"/>
+            <w:tcBorders>
+              <w:top w:val="single" w:color="BFC7D5" w:sz="4"/>
+              <w:left w:val="single" w:color="BFC7D5" w:sz="4"/>
+              <w:bottom w:val="single" w:color="BFC7D5" w:sz="4"/>
+              <w:right w:val="single" w:color="BFC7D5" w:sz="4"/>
+            </w:tcBorders>
+            <w:tcMar>
+              <w:top w:type="dxa" w:w="60"/>
+              <w:left w:type="dxa" w:w="90"/>
+              <w:bottom w:type="dxa" w:w="60"/>
+              <w:right w:type="dxa" w:w="90"/>
+            </w:tcMar>
+          </w:tcPr>
+          <w:p>
+            <w:r>
+              <w:rPr>
+                <w:b w:val="false"/>
+                <w:bCs w:val="false"/>
+                <w:color w:val="222222"/>
+                <w:sz w:val="17"/>
+                <w:szCs w:val="17"/>
+              </w:rPr>
+              <w:t xml:space="preserve">Feature works as specified; approved or changes requested</w:t>
+            </w:r>
+          </w:p>
+        </w:tc>
+        <w:tc>
+          <w:tcPr>
+            <w:tcW w:type="dxa" w:w="1560"/>
+            <w:tcBorders>
+              <w:top w:val="single" w:color="BFC7D5" w:sz="4"/>
+              <w:left w:val="single" w:color="BFC7D5" w:sz="4"/>
+              <w:bottom w:val="single" w:color="BFC7D5" w:sz="4"/>
+              <w:right w:val="single" w:color="BFC7D5" w:sz="4"/>
+            </w:tcBorders>
+            <w:tcMar>
+              <w:top w:type="dxa" w:w="60"/>
+              <w:left w:type="dxa" w:w="90"/>
+              <w:bottom w:type="dxa" w:w="60"/>
+              <w:right w:type="dxa" w:w="90"/>
+            </w:tcMar>
+          </w:tcPr>
+          <w:p>
+            <w:r>
+              <w:rPr>
+                <w:b w:val="false"/>
+                <w:bCs w:val="false"/>
+                <w:color w:val="222222"/>
+                <w:sz w:val="17"/>
+                <w:szCs w:val="17"/>
+              </w:rPr>
+              <w:t xml:space="preserve">EM26-34; ticket</w:t>
+            </w:r>
+          </w:p>
+        </w:tc>
+      </w:tr>
+      <w:tr>
+        <w:tc>
+          <w:tcPr>
+            <w:tcW w:type="dxa" w:w="2600"/>
+            <w:tcBorders>
+              <w:top w:val="single" w:color="BFC7D5" w:sz="4"/>
+              <w:left w:val="single" w:color="BFC7D5" w:sz="4"/>
+              <w:bottom w:val="single" w:color="BFC7D5" w:sz="4"/>
+              <w:right w:val="single" w:color="BFC7D5" w:sz="4"/>
+            </w:tcBorders>
+            <w:tcMar>
+              <w:top w:type="dxa" w:w="60"/>
+              <w:left w:type="dxa" w:w="90"/>
+              <w:bottom w:type="dxa" w:w="60"/>
+              <w:right w:type="dxa" w:w="90"/>
+            </w:tcMar>
+          </w:tcPr>
+          <w:p>
+            <w:r>
+              <w:rPr>
+                <w:b w:val="false"/>
+                <w:bCs w:val="false"/>
+                <w:color w:val="222222"/>
+                <w:sz w:val="17"/>
+                <w:szCs w:val="17"/>
+              </w:rPr>
+              <w:t xml:space="preserve">Feature review</w:t>
+            </w:r>
+          </w:p>
+        </w:tc>
+        <w:tc>
+          <w:tcPr>
+            <w:tcW w:type="dxa" w:w="2600"/>
+            <w:tcBorders>
+              <w:top w:val="single" w:color="BFC7D5" w:sz="4"/>
+              <w:left w:val="single" w:color="BFC7D5" w:sz="4"/>
+              <w:bottom w:val="single" w:color="BFC7D5" w:sz="4"/>
+              <w:right w:val="single" w:color="BFC7D5" w:sz="4"/>
+            </w:tcBorders>
+            <w:tcMar>
+              <w:top w:type="dxa" w:w="60"/>
+              <w:left w:type="dxa" w:w="90"/>
+              <w:bottom w:type="dxa" w:w="60"/>
+              <w:right w:type="dxa" w:w="90"/>
+            </w:tcMar>
+          </w:tcPr>
+          <w:p>
+            <w:r>
+              <w:rPr>
+                <w:b w:val="false"/>
+                <w:bCs w:val="false"/>
+                <w:color w:val="222222"/>
+                <w:sz w:val="17"/>
+                <w:szCs w:val="17"/>
+              </w:rPr>
+              <w:t xml:space="preserve">Alexander Peter</w:t>
+            </w:r>
+          </w:p>
+        </w:tc>
+        <w:tc>
+          <w:tcPr>
+            <w:tcW w:type="dxa" w:w="2600"/>
+            <w:tcBorders>
+              <w:top w:val="single" w:color="BFC7D5" w:sz="4"/>
+              <w:left w:val="single" w:color="BFC7D5" w:sz="4"/>
+              <w:bottom w:val="single" w:color="BFC7D5" w:sz="4"/>
+              <w:right w:val="single" w:color="BFC7D5" w:sz="4"/>
+            </w:tcBorders>
+            <w:tcMar>
+              <w:top w:type="dxa" w:w="60"/>
+              <w:left w:type="dxa" w:w="90"/>
+              <w:bottom w:type="dxa" w:w="60"/>
+              <w:right w:type="dxa" w:w="90"/>
+            </w:tcMar>
+          </w:tcPr>
+          <w:p>
+            <w:r>
+              <w:rPr>
+                <w:b w:val="false"/>
+                <w:bCs w:val="false"/>
+                <w:color w:val="222222"/>
+                <w:sz w:val="17"/>
+                <w:szCs w:val="17"/>
+              </w:rPr>
+              <w:t xml:space="preserve">Feature meets the client need; feedback actioned</w:t>
+            </w:r>
+          </w:p>
+        </w:tc>
+        <w:tc>
+          <w:tcPr>
+            <w:tcW w:type="dxa" w:w="1560"/>
+            <w:tcBorders>
+              <w:top w:val="single" w:color="BFC7D5" w:sz="4"/>
+              <w:left w:val="single" w:color="BFC7D5" w:sz="4"/>
+              <w:bottom w:val="single" w:color="BFC7D5" w:sz="4"/>
+              <w:right w:val="single" w:color="BFC7D5" w:sz="4"/>
+            </w:tcBorders>
+            <w:tcMar>
+              <w:top w:type="dxa" w:w="60"/>
+              <w:left w:type="dxa" w:w="90"/>
+              <w:bottom w:type="dxa" w:w="60"/>
+              <w:right w:type="dxa" w:w="90"/>
+            </w:tcMar>
+          </w:tcPr>
+          <w:p>
+            <w:r>
+              <w:rPr>
+                <w:b w:val="false"/>
+                <w:bCs w:val="false"/>
+                <w:color w:val="222222"/>
+                <w:sz w:val="17"/>
+                <w:szCs w:val="17"/>
+              </w:rPr>
+              <w:t xml:space="preserve">EM26-19</w:t>
+            </w:r>
+          </w:p>
+        </w:tc>
+      </w:tr>
+      <w:tr>
+        <w:tc>
+          <w:tcPr>
+            <w:tcW w:type="dxa" w:w="2600"/>
+            <w:tcBorders>
+              <w:top w:val="single" w:color="BFC7D5" w:sz="4"/>
+              <w:left w:val="single" w:color="BFC7D5" w:sz="4"/>
+              <w:bottom w:val="single" w:color="BFC7D5" w:sz="4"/>
+              <w:right w:val="single" w:color="BFC7D5" w:sz="4"/>
+            </w:tcBorders>
+            <w:tcMar>
+              <w:top w:type="dxa" w:w="60"/>
+              <w:left w:type="dxa" w:w="90"/>
+              <w:bottom w:type="dxa" w:w="60"/>
+              <w:right w:type="dxa" w:w="90"/>
+            </w:tcMar>
+          </w:tcPr>
+          <w:p>
+            <w:r>
+              <w:rPr>
+                <w:b w:val="false"/>
+                <w:bCs w:val="false"/>
+                <w:color w:val="222222"/>
+                <w:sz w:val="17"/>
+                <w:szCs w:val="17"/>
+              </w:rPr>
+              <w:t xml:space="preserve">Internal testing before an internal audit</w:t>
+            </w:r>
+          </w:p>
+        </w:tc>
+        <w:tc>
+          <w:tcPr>
+            <w:tcW w:type="dxa" w:w="2600"/>
+            <w:tcBorders>
+              <w:top w:val="single" w:color="BFC7D5" w:sz="4"/>
+              <w:left w:val="single" w:color="BFC7D5" w:sz="4"/>
+              <w:bottom w:val="single" w:color="BFC7D5" w:sz="4"/>
+              <w:right w:val="single" w:color="BFC7D5" w:sz="4"/>
+            </w:tcBorders>
+            <w:tcMar>
+              <w:top w:type="dxa" w:w="60"/>
+              <w:left w:type="dxa" w:w="90"/>
+              <w:bottom w:type="dxa" w:w="60"/>
+              <w:right w:type="dxa" w:w="90"/>
+            </w:tcMar>
+          </w:tcPr>
+          <w:p>
+            <w:r>
+              <w:rPr>
+                <w:b w:val="false"/>
+                <w:bCs w:val="false"/>
+                <w:color w:val="222222"/>
+                <w:sz w:val="17"/>
+                <w:szCs w:val="17"/>
+              </w:rPr>
+              <w:t xml:space="preserve">Richard Watson Stephen Amudha, Alexander Peter, Kishan Haravu Pradeep</w:t>
+            </w:r>
+          </w:p>
+        </w:tc>
+        <w:tc>
+          <w:tcPr>
+            <w:tcW w:type="dxa" w:w="2600"/>
+            <w:tcBorders>
+              <w:top w:val="single" w:color="BFC7D5" w:sz="4"/>
+              <w:left w:val="single" w:color="BFC7D5" w:sz="4"/>
+              <w:bottom w:val="single" w:color="BFC7D5" w:sz="4"/>
+              <w:right w:val="single" w:color="BFC7D5" w:sz="4"/>
+            </w:tcBorders>
+            <w:tcMar>
+              <w:top w:type="dxa" w:w="60"/>
+              <w:left w:type="dxa" w:w="90"/>
+              <w:bottom w:type="dxa" w:w="60"/>
+              <w:right w:type="dxa" w:w="90"/>
+            </w:tcMar>
+          </w:tcPr>
+          <w:p>
+            <w:r>
+              <w:rPr>
+                <w:b w:val="false"/>
+                <w:bCs w:val="false"/>
+                <w:color w:val="222222"/>
+                <w:sz w:val="17"/>
+                <w:szCs w:val="17"/>
+              </w:rPr>
+              <w:t xml:space="preserve">All features tested; results shown to the Managing Director</w:t>
+            </w:r>
+          </w:p>
+        </w:tc>
+        <w:tc>
+          <w:tcPr>
+            <w:tcW w:type="dxa" w:w="1560"/>
+            <w:tcBorders>
+              <w:top w:val="single" w:color="BFC7D5" w:sz="4"/>
+              <w:left w:val="single" w:color="BFC7D5" w:sz="4"/>
+              <w:bottom w:val="single" w:color="BFC7D5" w:sz="4"/>
+              <w:right w:val="single" w:color="BFC7D5" w:sz="4"/>
+            </w:tcBorders>
+            <w:tcMar>
+              <w:top w:type="dxa" w:w="60"/>
+              <w:left w:type="dxa" w:w="90"/>
+              <w:bottom w:type="dxa" w:w="60"/>
+              <w:right w:type="dxa" w:w="90"/>
+            </w:tcMar>
+          </w:tcPr>
+          <w:p>
+            <w:r>
+              <w:rPr>
+                <w:b w:val="false"/>
+                <w:bCs w:val="false"/>
+                <w:color w:val="222222"/>
+                <w:sz w:val="17"/>
+                <w:szCs w:val="17"/>
+              </w:rPr>
+              <w:t xml:space="preserve">EM26-34; audit report</w:t>
+            </w:r>
+          </w:p>
+        </w:tc>
+      </w:tr>
+    </w:tbl>
+    <w:p>
+      <w:pPr>
+        <w:spacing w:after="120"/>
+      </w:pPr>
+    </w:p>
+    <w:p>
+      <w:pPr>
+        <w:pStyle w:val="Heading1"/>
+      </w:pPr>
+      <w:r>
+        <w:t xml:space="preserve">11. Golden test rule</w:t>
+      </w:r>
+    </w:p>
+    <w:p>
+      <w:pPr>
+        <w:pStyle w:val="ListParagraph"/>
+        <w:numPr>
+          <w:ilvl w:val="0"/>
+          <w:numId w:val="2"/>
+        </w:numPr>
+        <w:spacing w:after="60"/>
+      </w:pPr>
+      <w:r>
+        <w:t xml:space="preserve">Upload the domain test documents; ask the golden questions; record answers and scores in git (eval/reports).</w:t>
+      </w:r>
+    </w:p>
+    <w:p>
+      <w:pPr>
+        <w:pStyle w:val="ListParagraph"/>
+        <w:numPr>
+          <w:ilvl w:val="0"/>
+          <w:numId w:val="2"/>
+        </w:numPr>
+        <w:spacing w:after="60"/>
+      </w:pPr>
+      <w:r>
+        <w:t xml:space="preserve">Compare with the previous run; below 49/52 blocks the release.</w:t>
+      </w:r>
+    </w:p>
+    <w:p>
+      <w:pPr>
+        <w:pStyle w:val="ListParagraph"/>
+        <w:numPr>
+          <w:ilvl w:val="0"/>
+          <w:numId w:val="2"/>
+        </w:numPr>
+        <w:spacing w:after="60"/>
+      </w:pPr>
+      <w:r>
+        <w:t xml:space="preserve">Keep reference screenshots with the evidence.</w:t>
       </w:r>
     </w:p>
     <w:sectPr>

</xml_diff>